<commit_message>
Erasmo Carlos: revisão da Parte 3
Co-Authored-By: Claude Opus 5.5 <noreply@anthropic.com>
Claude-Session: https://claude.ai/code/session_01MJjUEEZrxQDEUifKK2vj9g
</commit_message>
<xml_diff>
--- a/roteiros/erasmo-carlos/Erasmo_Parte3.docx
+++ b/roteiros/erasmo-carlos/Erasmo_Parte3.docx
@@ -63,7 +63,7 @@
         <w:rPr>
           <w:color w:val="000000"/>
         </w:rPr>
-        <w:t>Detalhes. As Curvas da Estrada de Santos. Canções que Roberto gravava e que tocavam em todas as rádios do país.</w:t>
+        <w:t>Detalhes. As Curvas da Estrada de Santos. Canções que Roberto gravava e que tocavam em todas as rádios do país. Detalhes, lançada por Roberto em mil novecentos e setenta e um, virou uma das músicas mais regravadas e mais cantadas da história do Brasil.</w:t>
       </w:r>
     </w:p>
     <w:p>
@@ -71,7 +71,7 @@
         <w:rPr>
           <w:color w:val="000000"/>
         </w:rPr>
-        <w:t>Muita gente cantava aquelas músicas sem saber que metade delas tinha nascido da cabeça do grandalhão da Tijuca.</w:t>
+        <w:t>Muita gente cantava aquelas músicas sem saber que elas também tinham nascido da cabeça do grandalhão da Tijuca.</w:t>
       </w:r>
     </w:p>
     <w:p>
@@ -87,7 +87,7 @@
         <w:rPr>
           <w:color w:val="000000"/>
         </w:rPr>
-        <w:t>Foi nessa fase que Erasmo e Narinha oficializaram a vida juntos. O casamento ia durar treze anos.</w:t>
+        <w:t>O casamento com Narinha ia durar treze anos. Ela seguia com a profissão dela, cuidando de jardins, enquanto os meninos cresciam.</w:t>
       </w:r>
     </w:p>
     <w:p>
@@ -95,15 +95,7 @@
         <w:rPr>
           <w:color w:val="000000"/>
         </w:rPr>
-        <w:t>Narinha tinha a profissão dela e os jardins dela. A fama do marido nunca foi o centro da vida dela.</w:t>
-      </w:r>
-    </w:p>
-    <w:p>
-      <w:r>
-        <w:rPr>
-          <w:color w:val="000000"/>
-        </w:rPr>
-        <w:t>Os meninos foram crescendo. Alexandre, o mais velho, ia seguir o caminho do pai na música. Gil ia virar baterista. Leonardo, o caçula, ia acabar cuidando dos negócios da família.</w:t>
+        <w:t>Gil ia virar baterista. Leonardo, o caçula, ia acabar cuidando dos negócios da família.</w:t>
       </w:r>
     </w:p>
     <w:p>
@@ -127,7 +119,7 @@
         <w:rPr>
           <w:color w:val="000000"/>
         </w:rPr>
-        <w:t>A primeira faixa era uma homenagem à força das mulheres. Um homem com fama de mau cantando que a mulher estava longe de ser o sexo frágil.</w:t>
+        <w:t>A primeira faixa era uma homenagem à força das mulheres. Um homem com fama de mau cantando que a mulher estava longe de ser o sexo frágil. A música virou uma das mais conhecidas da carreira dele.</w:t>
       </w:r>
     </w:p>
     <w:p>
@@ -151,7 +143,7 @@
         <w:rPr>
           <w:color w:val="000000"/>
         </w:rPr>
-        <w:t>Por fora, era a imagem de uma família feliz. O roqueiro da Jovem Guarda, a mulher bonita ao lado e três filhos crescendo no Rio de Janeiro.</w:t>
+        <w:t>Por fora, era a imagem de uma família feliz. O roqueiro da Jovem Guarda com a mulher ao lado e os filhos crescendo no Rio de Janeiro.</w:t>
       </w:r>
     </w:p>
     <w:p>
@@ -191,7 +183,7 @@
         <w:rPr>
           <w:color w:val="000000"/>
         </w:rPr>
-        <w:t>Uma cantora jovem chamada Marina Lima regravou uma música dele e de Roberto, Mesmo Que Seja Eu. A gravação virou sucesso e apresentou o Tremendão para uma geração inteira que nem tinha visto a Jovem Guarda.</w:t>
+        <w:t>Uma cantora jovem chamada Marina Lima regravou, no disco Fullgás, uma música dele e de Roberto. Mesmo Que Seja Eu. A gravação virou sucesso e apresentou o Tremendão para uma geração inteira que nem tinha visto a Jovem Guarda.</w:t>
       </w:r>
     </w:p>
     <w:p>
@@ -231,7 +223,7 @@
         <w:rPr>
           <w:color w:val="000000"/>
         </w:rPr>
-        <w:t>Roberta estava em todas as revistas. Naquele mesmo ano, tinha posado para a Playboy, numa das edições mais comentadas da história da revista no Brasil. Muita gente a chamava de a mulher mais bonita do país.</w:t>
+        <w:t>Roberta estava em todas as revistas. Naquele mesmo ano, tinha posado para a Playboy, numa edição que deu muito o que falar. Muita gente a chamava de a mulher mais bonita do país.</w:t>
       </w:r>
     </w:p>
     <w:p>
@@ -239,7 +231,7 @@
         <w:rPr>
           <w:color w:val="000000"/>
         </w:rPr>
-        <w:t>Erasmo e Roberta gravaram juntos um videoclipe no Rio de Janeiro. Depois, apareceram lado a lado na capa da revista Manchete.</w:t>
+        <w:t>Erasmo e Roberta gravaram juntos um videoclipe no Rio de Janeiro. Também apareceram lado a lado na capa da revista Manchete.</w:t>
       </w:r>
     </w:p>
     <w:p>
@@ -367,7 +359,7 @@
         <w:rPr>
           <w:color w:val="000000"/>
         </w:rPr>
-        <w:t>O objeto continuava lá. No mesmo lugar.</w:t>
+        <w:t>O objeto continuava lá. No mesmo lugar. Ninguém imaginava que um dia ele ia sair dali.</w:t>
       </w:r>
     </w:p>
     <w:p>
@@ -376,14 +368,6 @@
           <w:color w:val="C00000"/>
         </w:rPr>
         <w:t>Guarde esta data. Quatro de junho de mil novecentos e oitenta e quatro. Porque é nesse dia que o barulho do começo desta história finalmente acontece.</w:t>
-      </w:r>
-    </w:p>
-    <w:p>
-      <w:r>
-        <w:rPr>
-          <w:color w:val="000000"/>
-        </w:rPr>
-        <w:t>Quatro de junho de mil novecentos e oitenta e quatro.</w:t>
       </w:r>
     </w:p>
     <w:p>
@@ -407,7 +391,7 @@
         <w:rPr>
           <w:color w:val="000000"/>
         </w:rPr>
-        <w:t>Dentro de casa também havia crianças. Alexandre, o mais velho, tinha por volta de dez anos. Gil e Leonardo eram ainda menores.</w:t>
+        <w:t>Naquela casa viviam três crianças. Alexandre, o mais velho, tinha por volta de dez anos. Gil e Leonardo eram ainda menores.</w:t>
       </w:r>
     </w:p>
     <w:p>
@@ -551,7 +535,7 @@
         <w:rPr>
           <w:color w:val="000000"/>
         </w:rPr>
-        <w:t>Para a polícia, para a imprensa e para o público, a história terminava ali.</w:t>
+        <w:t>Oficialmente, a história terminava ali.</w:t>
       </w:r>
     </w:p>
     <w:p>

</xml_diff>